<commit_message>
attempted face recovery plan
</commit_message>
<xml_diff>
--- a/log.docx
+++ b/log.docx
@@ -444,6 +444,448 @@
       </w:pPr>
       <w:r>
         <w:t xml:space="preserve">- Validated guard rejection reports under output/identity_persistence_stronger_schedule_steady_3x49_seed42/segment_scores/realistic_steady_portrait_episodic_seed42/*_guarded_update/guarded_memory_update.csv.</w:t>
+      </w:r>
+    </w:p>
+    <w:p>
+      <w:pPr>
+        <w:pStyle w:val="Heading1"/>
+        <w:spacing w:before="240" w:after="120"/>
+      </w:pPr>
+      <w:r>
+        <w:rPr>
+          <w:b/>
+          <w:sz w:val="28"/>
+          <w:szCs w:val="28"/>
+        </w:rPr>
+        <w:t xml:space="preserve">Step 4 - Face-Recovery Implementation Checkpoint</w:t>
+      </w:r>
+    </w:p>
+    <w:p>
+      <w:pPr>
+        <w:spacing w:after="80"/>
+      </w:pPr>
+      <w:r>
+        <w:t xml:space="preserve">Implemented the first pass of the detector-guided face-preservation recovery plan from docs/next_implementation_plan.md.</w:t>
+      </w:r>
+    </w:p>
+    <w:p>
+      <w:pPr>
+        <w:spacing w:after="80"/>
+      </w:pPr>
+      <w:r>
+        <w:t xml:space="preserve">Code changes made:</w:t>
+      </w:r>
+    </w:p>
+    <w:p>
+      <w:pPr>
+        <w:ind w:left="360" w:hanging="180"/>
+      </w:pPr>
+      <w:r>
+        <w:t xml:space="preserve">- Added util/face_recovery.py with recovery profiles, face-guard pass/fail logic, detection-first attempt ranking, and readable failure reasons.</w:t>
+      </w:r>
+    </w:p>
+    <w:p>
+      <w:pPr>
+        <w:ind w:left="360" w:hanging="180"/>
+      </w:pPr>
+      <w:r>
+        <w:t xml:space="preserve">- Updated infer.py with --local_face_scale, --prompt_enhancement_suffix, and --negative_prompt_append so recovery attempts can strengthen face conditioning without retraining.</w:t>
+      </w:r>
+    </w:p>
+    <w:p>
+      <w:pPr>
+        <w:ind w:left="360" w:hanging="180"/>
+      </w:pPr>
+      <w:r>
+        <w:t xml:space="preserve">- Updated eval/run_identity_persistence_experiment.py with --face_recovery, multiple recovery profiles, prompt/negative-prompt variants, seed offsets, local_face_scale overrides, and detection-first best-attempt selection.</w:t>
+      </w:r>
+    </w:p>
+    <w:p>
+      <w:pPr>
+        <w:ind w:left="360" w:hanging="180"/>
+      </w:pPr>
+      <w:r>
+        <w:t xml:space="preserve">- Updated eval/arcface_identity_stability.py to report zero_face_chunks, max_consecutive_missing_frames, face bbox area ratio, and face center stability.</w:t>
+      </w:r>
+    </w:p>
+    <w:p>
+      <w:pPr>
+        <w:ind w:left="360" w:hanging="180"/>
+      </w:pPr>
+      <w:r>
+        <w:t xml:space="preserve">- Updated tools/guarded_memory_update_from_video.py to carry bbox area and detection score into guarded memory update reports when available.</w:t>
+      </w:r>
+    </w:p>
+    <w:p>
+      <w:pPr>
+        <w:ind w:left="360" w:hanging="180"/>
+      </w:pPr>
+      <w:r>
+        <w:t xml:space="preserve">- Added eval/identity_prompt_suite_face_recovery.json for the planned smoke and broader recovery experiments.</w:t>
+      </w:r>
+    </w:p>
+    <w:p>
+      <w:pPr>
+        <w:spacing w:after="80"/>
+      </w:pPr>
+      <w:r>
+        <w:t xml:space="preserve">Verification so far: py_compile passed for infer.py, eval/run_identity_persistence_experiment.py, eval/arcface_identity_stability.py, tools/guarded_memory_update_from_video.py, and util/face_recovery.py.</w:t>
+      </w:r>
+    </w:p>
+    <w:p>
+      <w:pPr>
+        <w:spacing w:after="80"/>
+      </w:pPr>
+      <w:r>
+        <w:t xml:space="preserve">What worked: the implementation compiles and is scoped to the planned inference-time recovery path. No model retraining or latent/history injection has been added.</w:t>
+      </w:r>
+    </w:p>
+    <w:p>
+      <w:pPr>
+        <w:spacing w:after="80"/>
+      </w:pPr>
+      <w:r>
+        <w:t xml:space="preserve">What has not been tested yet: command generation, actual GPU recovery runs, and whether recovery reduces zero-face chunks.</w:t>
+      </w:r>
+    </w:p>
+    <w:p>
+      <w:pPr>
+        <w:pStyle w:val="Heading1"/>
+        <w:spacing w:before="240" w:after="120"/>
+      </w:pPr>
+      <w:r>
+        <w:rPr>
+          <w:b/>
+          <w:sz w:val="28"/>
+          <w:szCs w:val="28"/>
+        </w:rPr>
+        <w:t xml:space="preserve">Step 5 - Face-Recovery Dry Run</w:t>
+      </w:r>
+    </w:p>
+    <w:p>
+      <w:pPr>
+        <w:spacing w:after="80"/>
+      </w:pPr>
+      <w:r>
+        <w:t xml:space="preserve">Ran a dry run for the steady_portrait 3x49 smoke configuration using eval/identity_prompt_suite_long_horizon_smoke.json.</w:t>
+      </w:r>
+    </w:p>
+    <w:p>
+      <w:pPr>
+        <w:spacing w:after="80"/>
+      </w:pPr>
+      <w:r>
+        <w:t xml:space="preserve">What worked:</w:t>
+      </w:r>
+    </w:p>
+    <w:p>
+      <w:pPr>
+        <w:ind w:left="360" w:hanging="180"/>
+      </w:pPr>
+      <w:r>
+        <w:t xml:space="preserve">- The runner generated three attempts per segment when --face_recovery was enabled.</w:t>
+      </w:r>
+    </w:p>
+    <w:p>
+      <w:pPr>
+        <w:ind w:left="360" w:hanging="180"/>
+      </w:pPr>
+      <w:r>
+        <w:t xml:space="preserve">- Attempt 0 uses the scheduled identity retrieval profile with the original prompt.</w:t>
+      </w:r>
+    </w:p>
+    <w:p>
+      <w:pPr>
+        <w:ind w:left="360" w:hanging="180"/>
+      </w:pPr>
+      <w:r>
+        <w:t xml:space="preserve">- Attempt 1 uses seed +101, top_k=6, base_weight=0.25, local_face_scale=1.25, a face-visible prompt suffix, and a negative prompt against hidden/cropped/occluded faces.</w:t>
+      </w:r>
+    </w:p>
+    <w:p>
+      <w:pPr>
+        <w:ind w:left="360" w:hanging="180"/>
+      </w:pPr>
+      <w:r>
+        <w:t xml:space="preserve">- Attempt 2 uses seed +202, top_k=6, base_weight=0.2, local_face_scale=1.5, and the same face-preservation prompt/negative prompt.</w:t>
+      </w:r>
+    </w:p>
+    <w:p>
+      <w:pPr>
+        <w:ind w:left="360" w:hanging="180"/>
+      </w:pPr>
+      <w:r>
+        <w:t xml:space="preserve">- The generated commands point at the per-run online memory bank, so guarded online updates will not mutate the original multi-reference identity bank.</w:t>
+      </w:r>
+    </w:p>
+    <w:p>
+      <w:pPr>
+        <w:spacing w:after="80"/>
+      </w:pPr>
+      <w:r>
+        <w:t xml:space="preserve">What did not run yet: no videos were generated in the dry run, so no detection/identity recovery result is available from this checkpoint.</w:t>
+      </w:r>
+    </w:p>
+    <w:p>
+      <w:pPr>
+        <w:pStyle w:val="Heading1"/>
+        <w:spacing w:before="240" w:after="120"/>
+      </w:pPr>
+      <w:r>
+        <w:rPr>
+          <w:b/>
+          <w:sz w:val="28"/>
+          <w:szCs w:val="28"/>
+        </w:rPr>
+        <w:t xml:space="preserve">Step 6 - Face-Recovery Smoke Test Results</w:t>
+      </w:r>
+    </w:p>
+    <w:p>
+      <w:pPr>
+        <w:spacing w:after="80"/>
+      </w:pPr>
+      <w:r>
+        <w:t xml:space="preserve">Ran the full steady_portrait 3x49 GPU smoke test with --face_recovery enabled, three attempts per segment, online memory update enabled, and strict guarded memory thresholds.</w:t>
+      </w:r>
+    </w:p>
+    <w:p>
+      <w:pPr>
+        <w:spacing w:after="80"/>
+      </w:pPr>
+      <w:r>
+        <w:t xml:space="preserve">Output directory: output/identity_persistence_face_recovery_smoke_steady_3x49_seed42.</w:t>
+      </w:r>
+    </w:p>
+    <w:p>
+      <w:pPr>
+        <w:spacing w:after="80"/>
+      </w:pPr>
+      <w:r>
+        <w:t xml:space="preserve">Final joined-video metrics:</w:t>
+      </w:r>
+    </w:p>
+    <w:p>
+      <w:pPr>
+        <w:ind w:left="360" w:hanging="180"/>
+      </w:pPr>
+      <w:r>
+        <w:t xml:space="preserve">- Detection rate: 0.2245, with 33 detected frames out of 147.</w:t>
+      </w:r>
+    </w:p>
+    <w:p>
+      <w:pPr>
+        <w:ind w:left="360" w:hanging="180"/>
+      </w:pPr>
+      <w:r>
+        <w:t xml:space="preserve">- Mean ArcFace similarity on detected frames: 0.4887.</w:t>
+      </w:r>
+    </w:p>
+    <w:p>
+      <w:pPr>
+        <w:ind w:left="360" w:hanging="180"/>
+      </w:pPr>
+      <w:r>
+        <w:t xml:space="preserve">- Min ArcFace similarity on detected frames: 0.4005.</w:t>
+      </w:r>
+    </w:p>
+    <w:p>
+      <w:pPr>
+        <w:ind w:left="360" w:hanging="180"/>
+      </w:pPr>
+      <w:r>
+        <w:t xml:space="preserve">- Zero-face chunks: 2 of 3.</w:t>
+      </w:r>
+    </w:p>
+    <w:p>
+      <w:pPr>
+        <w:ind w:left="360" w:hanging="180"/>
+      </w:pPr>
+      <w:r>
+        <w:t xml:space="preserve">- Max consecutive missing frames: 98.</w:t>
+      </w:r>
+    </w:p>
+    <w:p>
+      <w:pPr>
+        <w:ind w:left="360" w:hanging="180"/>
+      </w:pPr>
+      <w:r>
+        <w:t xml:space="preserve">- Mean face area ratio on detected frames: 0.5626.</w:t>
+      </w:r>
+    </w:p>
+    <w:p>
+      <w:pPr>
+        <w:spacing w:after="80"/>
+      </w:pPr>
+      <w:r>
+        <w:t xml:space="preserve">Per-segment attempt results:</w:t>
+      </w:r>
+    </w:p>
+    <w:p>
+      <w:pPr>
+        <w:ind w:left="360" w:hanging="180"/>
+      </w:pPr>
+      <w:r>
+        <w:t xml:space="preserve">- Segment 0 attempt 0 detected faces in 67.35% of frames but failed the 0.75 face guard; attempts 1 and 2 both had 0.00 detection. Attempt 0 was selected as least-bad.</w:t>
+      </w:r>
+    </w:p>
+    <w:p>
+      <w:pPr>
+        <w:ind w:left="360" w:hanging="180"/>
+      </w:pPr>
+      <w:r>
+        <w:t xml:space="preserve">- Segment 1 attempts 0, 1, and 2 all had 0.00 detection. Attempt 0 was selected by tie-breaking because all attempts failed.</w:t>
+      </w:r>
+    </w:p>
+    <w:p>
+      <w:pPr>
+        <w:ind w:left="360" w:hanging="180"/>
+      </w:pPr>
+      <w:r>
+        <w:t xml:space="preserve">- Segment 2 attempts 0, 1, and 2 all had 0.00 detection. Attempt 0 was selected by tie-breaking because all attempts failed.</w:t>
+      </w:r>
+    </w:p>
+    <w:p>
+      <w:pPr>
+        <w:spacing w:after="80"/>
+      </w:pPr>
+      <w:r>
+        <w:t xml:space="preserve">Comparison to the previous stronger-schedule run:</w:t>
+      </w:r>
+    </w:p>
+    <w:p>
+      <w:pPr>
+        <w:ind w:left="360" w:hanging="180"/>
+      </w:pPr>
+      <w:r>
+        <w:t xml:space="preserve">- Previous stronger-schedule detection rate: 0.2313; face-recovery smoke detection rate: 0.2245.</w:t>
+      </w:r>
+    </w:p>
+    <w:p>
+      <w:pPr>
+        <w:ind w:left="360" w:hanging="180"/>
+      </w:pPr>
+      <w:r>
+        <w:t xml:space="preserve">- Previous stronger-schedule mean similarity: 0.5678; face-recovery smoke mean similarity: 0.4887.</w:t>
+      </w:r>
+    </w:p>
+    <w:p>
+      <w:pPr>
+        <w:ind w:left="360" w:hanging="180"/>
+      </w:pPr>
+      <w:r>
+        <w:t xml:space="preserve">- Previous stronger-schedule zero-face chunks: 2 of 3; face-recovery smoke zero-face chunks: 2 of 3.</w:t>
+      </w:r>
+    </w:p>
+    <w:p>
+      <w:pPr>
+        <w:spacing w:after="80"/>
+      </w:pPr>
+      <w:r>
+        <w:t xml:space="preserve">What worked:</w:t>
+      </w:r>
+    </w:p>
+    <w:p>
+      <w:pPr>
+        <w:ind w:left="360" w:hanging="180"/>
+      </w:pPr>
+      <w:r>
+        <w:t xml:space="preserve">- The recovery loop triggered correctly when segment attempts failed detection/identity thresholds.</w:t>
+      </w:r>
+    </w:p>
+    <w:p>
+      <w:pPr>
+        <w:ind w:left="360" w:hanging="180"/>
+      </w:pPr>
+      <w:r>
+        <w:t xml:space="preserve">- The runner produced per-attempt CSV/JSON logs with seed offset, prompt profile, local_face_scale, detection, identity, zero-face chunk, missing-streak, and accepted-attempt fields.</w:t>
+      </w:r>
+    </w:p>
+    <w:p>
+      <w:pPr>
+        <w:ind w:left="360" w:hanging="180"/>
+      </w:pPr>
+      <w:r>
+        <w:t xml:space="preserve">- The evaluator now tracks face area and missing-streak metrics needed for generation-time recovery diagnostics.</w:t>
+      </w:r>
+    </w:p>
+    <w:p>
+      <w:pPr>
+        <w:ind w:left="360" w:hanging="180"/>
+      </w:pPr>
+      <w:r>
+        <w:t xml:space="preserve">- The guarded online memory path correctly rejected every low-detection segment and did not poison the working identity bank.</w:t>
+      </w:r>
+    </w:p>
+    <w:p>
+      <w:pPr>
+        <w:spacing w:after="80"/>
+      </w:pPr>
+      <w:r>
+        <w:t xml:space="preserve">What did not work:</w:t>
+      </w:r>
+    </w:p>
+    <w:p>
+      <w:pPr>
+        <w:ind w:left="360" w:hanging="180"/>
+      </w:pPr>
+      <w:r>
+        <w:t xml:space="preserve">- The face-visible prompt suffix plus stronger local_face_scale did not recover missing-face chunks.</w:t>
+      </w:r>
+    </w:p>
+    <w:p>
+      <w:pPr>
+        <w:ind w:left="360" w:hanging="180"/>
+      </w:pPr>
+      <w:r>
+        <w:t xml:space="preserve">- The stronger recovery attempts often collapsed to 0.00 face detection, including segment 0 attempts 1 and 2.</w:t>
+      </w:r>
+    </w:p>
+    <w:p>
+      <w:pPr>
+        <w:ind w:left="360" w:hanging="180"/>
+      </w:pPr>
+      <w:r>
+        <w:t xml:space="preserve">- The smoke test did not meet the plan success criteria: detection did not reach 0.75, zero-face chunks were not reduced to 0, and mean identity similarity dropped below the previous stronger-schedule run.</w:t>
+      </w:r>
+    </w:p>
+    <w:p>
+      <w:pPr>
+        <w:spacing w:after="80"/>
+      </w:pPr>
+      <w:r>
+        <w:t xml:space="preserve">Follow-up adjustment:</w:t>
+      </w:r>
+    </w:p>
+    <w:p>
+      <w:pPr>
+        <w:ind w:left="360" w:hanging="180"/>
+      </w:pPr>
+      <w:r>
+        <w:t xml:space="preserve">- Added a closer-portrait fallback prompt as the final recovery profile after the full smoke run, matching the original implementation plan more closely.</w:t>
+      </w:r>
+    </w:p>
+    <w:p>
+      <w:pPr>
+        <w:ind w:left="360" w:hanging="180"/>
+      </w:pPr>
+      <w:r>
+        <w:t xml:space="preserve">- The fallback profile compiled and dry-ran correctly for a focused seed-43 one-segment probe.</w:t>
+      </w:r>
+    </w:p>
+    <w:p>
+      <w:pPr>
+        <w:ind w:left="360" w:hanging="180"/>
+      </w:pPr>
+      <w:r>
+        <w:t xml:space="preserve">- The focused GPU fallback probe could not be executed because elevated GPU execution was rejected by the platform usage limit. No workaround was attempted.</w:t>
+      </w:r>
+    </w:p>
+    <w:p>
+      <w:pPr>
+        <w:spacing w:after="80"/>
+      </w:pPr>
+      <w:r>
+        <w:t xml:space="preserve">Conclusion: the recovery infrastructure is useful and now measurable, but the current prompt/scale-only recovery action is not sufficient. The next coding experiment should use a more conservative recovery profile first, then test the close-up fallback as a separate accepted-replacement strategy rather than blending it into the same long-video prompt.</w:t>
       </w:r>
     </w:p>
     <w:sectPr>

</xml_diff>